<commit_message>
feat: actualizar plantilla dni
</commit_message>
<xml_diff>
--- a/pesaje/analytica/Report/LoteDniBase.docx
+++ b/pesaje/analytica/Report/LoteDniBase.docx
@@ -36,7 +36,7 @@
           <w:p>
             <w:pPr>
               <w:spacing w:before="0" w:after="0"/>
-              <w:ind w:left="114" w:right="-54"/>
+              <w:ind w:left="114" w:right="513"/>
               <w:jc w:val="center"/>
               <w:rPr>
                 <w:rFonts w:ascii="Aptos Black" w:hAnsi="Aptos Black"/>
@@ -48,179 +48,6 @@
             </w:pPr>
             <w:r>
               <w:rPr>
-                <w:noProof/>
-              </w:rPr>
-              <mc:AlternateContent>
-                <mc:Choice Requires="wps">
-                  <w:drawing>
-                    <wp:anchor distT="0" distB="0" distL="114300" distR="114300" simplePos="0" relativeHeight="251686912" behindDoc="0" locked="0" layoutInCell="1" allowOverlap="1" wp14:anchorId="39E9AB35" wp14:editId="6A8D7C1F">
-                      <wp:simplePos x="0" y="0"/>
-                      <wp:positionH relativeFrom="margin">
-                        <wp:posOffset>3400158</wp:posOffset>
-                      </wp:positionH>
-                      <wp:positionV relativeFrom="paragraph">
-                        <wp:posOffset>-3945</wp:posOffset>
-                      </wp:positionV>
-                      <wp:extent cx="1640004" cy="814137"/>
-                      <wp:effectExtent l="0" t="0" r="0" b="0"/>
-                      <wp:wrapNone/>
-                      <wp:docPr id="782399144" name="Rectángulo: esquinas redondeadas 782399144"/>
-                      <wp:cNvGraphicFramePr>
-                        <a:graphicFrameLocks xmlns:a="http://schemas.openxmlformats.org/drawingml/2006/main"/>
-                      </wp:cNvGraphicFramePr>
-                      <a:graphic xmlns:a="http://schemas.openxmlformats.org/drawingml/2006/main">
-                        <a:graphicData uri="http://schemas.microsoft.com/office/word/2010/wordprocessingShape">
-                          <wps:wsp>
-                            <wps:cNvSpPr>
-                              <a:spLocks noChangeArrowheads="1"/>
-                            </wps:cNvSpPr>
-                            <wps:spPr bwMode="auto">
-                              <a:xfrm>
-                                <a:off x="0" y="0"/>
-                                <a:ext cx="1640004" cy="814137"/>
-                              </a:xfrm>
-                              <a:prstGeom prst="roundRect">
-                                <a:avLst>
-                                  <a:gd name="adj" fmla="val 16667"/>
-                                </a:avLst>
-                              </a:prstGeom>
-                              <a:noFill/>
-                              <a:ln w="9525">
-                                <a:noFill/>
-                                <a:miter lim="800000"/>
-                                <a:headEnd/>
-                                <a:tailEnd/>
-                              </a:ln>
-                            </wps:spPr>
-                            <wps:txbx>
-                              <w:txbxContent>
-                                <w:p>
-                                  <w:pPr>
-                                    <w:ind w:right="91"/>
-                                    <w:jc w:val="center"/>
-                                  </w:pPr>
-                                  <w:r>
-                                    <w:rPr>
-                                      <w:rFonts w:ascii="Arial" w:eastAsia="Arial Unicode MS" w:hAnsi="Arial"/>
-                                      <w:sz w:val="18"/>
-                                      <w:szCs w:val="18"/>
-                                    </w:rPr>
-                                    <w:fldChar w:fldCharType="begin"/>
-                                  </w:r>
-                                  <w:r>
-                                    <w:rPr>
-                                      <w:rFonts w:ascii="Arial" w:eastAsia="Arial Unicode MS" w:hAnsi="Arial"/>
-                                      <w:sz w:val="18"/>
-                                      <w:szCs w:val="18"/>
-                                    </w:rPr>
-                                    <w:instrText xml:space="preserve"> MERGEFIELD  Image:logo_empresa  \* MERGEFORMAT </w:instrText>
-                                  </w:r>
-                                  <w:r>
-                                    <w:rPr>
-                                      <w:rFonts w:ascii="Arial" w:eastAsia="Arial Unicode MS" w:hAnsi="Arial"/>
-                                      <w:sz w:val="18"/>
-                                      <w:szCs w:val="18"/>
-                                    </w:rPr>
-                                    <w:fldChar w:fldCharType="separate"/>
-                                  </w:r>
-                                  <w:r>
-                                    <w:rPr>
-                                      <w:rFonts w:ascii="Arial" w:eastAsia="Arial Unicode MS" w:hAnsi="Arial"/>
-                                      <w:noProof/>
-                                      <w:sz w:val="18"/>
-                                      <w:szCs w:val="18"/>
-                                    </w:rPr>
-                                    <w:t>«Image:logo_empresa»</w:t>
-                                  </w:r>
-                                  <w:r>
-                                    <w:rPr>
-                                      <w:rFonts w:ascii="Arial" w:eastAsia="Arial Unicode MS" w:hAnsi="Arial"/>
-                                      <w:sz w:val="18"/>
-                                      <w:szCs w:val="18"/>
-                                    </w:rPr>
-                                    <w:fldChar w:fldCharType="end"/>
-                                  </w:r>
-                                </w:p>
-                              </w:txbxContent>
-                            </wps:txbx>
-                            <wps:bodyPr rot="0" vertOverflow="clip" horzOverflow="clip" vert="horz" wrap="square" lIns="91440" tIns="45720" rIns="91440" bIns="45720" anchor="t" anchorCtr="0" upright="1">
-                              <a:noAutofit/>
-                            </wps:bodyPr>
-                          </wps:wsp>
-                        </a:graphicData>
-                      </a:graphic>
-                      <wp14:sizeRelH relativeFrom="margin">
-                        <wp14:pctWidth>0</wp14:pctWidth>
-                      </wp14:sizeRelH>
-                      <wp14:sizeRelV relativeFrom="margin">
-                        <wp14:pctHeight>0</wp14:pctHeight>
-                      </wp14:sizeRelV>
-                    </wp:anchor>
-                  </w:drawing>
-                </mc:Choice>
-                <mc:Fallback>
-                  <w:pict>
-                    <v:roundrect w14:anchorId="39E9AB35" id="Rectángulo: esquinas redondeadas 782399144" o:spid="_x0000_s1026" style="position:absolute;left:0;text-align:left;margin-left:267.75pt;margin-top:-.3pt;width:129.15pt;height:64.1pt;z-index:251686912;visibility:visible;mso-wrap-style:square;mso-width-percent:0;mso-height-percent:0;mso-wrap-distance-left:9pt;mso-wrap-distance-top:0;mso-wrap-distance-right:9pt;mso-wrap-distance-bottom:0;mso-position-horizontal:absolute;mso-position-horizontal-relative:margin;mso-position-vertical:absolute;mso-position-vertical-relative:text;mso-width-percent:0;mso-height-percent:0;mso-width-relative:margin;mso-height-relative:margin;v-text-anchor:top" arcsize="10923f" o:gfxdata="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" filled="f" stroked="f">
-                      <v:stroke joinstyle="miter"/>
-                      <v:textbox>
-                        <w:txbxContent>
-                          <w:p>
-                            <w:pPr>
-                              <w:ind w:right="91"/>
-                              <w:jc w:val="center"/>
-                            </w:pPr>
-                            <w:r>
-                              <w:rPr>
-                                <w:rFonts w:ascii="Arial" w:eastAsia="Arial Unicode MS" w:hAnsi="Arial"/>
-                                <w:sz w:val="18"/>
-                                <w:szCs w:val="18"/>
-                              </w:rPr>
-                              <w:fldChar w:fldCharType="begin"/>
-                            </w:r>
-                            <w:r>
-                              <w:rPr>
-                                <w:rFonts w:ascii="Arial" w:eastAsia="Arial Unicode MS" w:hAnsi="Arial"/>
-                                <w:sz w:val="18"/>
-                                <w:szCs w:val="18"/>
-                              </w:rPr>
-                              <w:instrText xml:space="preserve"> MERGEFIELD  Image:logo_empresa  \* MERGEFORMAT </w:instrText>
-                            </w:r>
-                            <w:r>
-                              <w:rPr>
-                                <w:rFonts w:ascii="Arial" w:eastAsia="Arial Unicode MS" w:hAnsi="Arial"/>
-                                <w:sz w:val="18"/>
-                                <w:szCs w:val="18"/>
-                              </w:rPr>
-                              <w:fldChar w:fldCharType="separate"/>
-                            </w:r>
-                            <w:r>
-                              <w:rPr>
-                                <w:rFonts w:ascii="Arial" w:eastAsia="Arial Unicode MS" w:hAnsi="Arial"/>
-                                <w:noProof/>
-                                <w:sz w:val="18"/>
-                                <w:szCs w:val="18"/>
-                              </w:rPr>
-                              <w:t>«Image:logo_empresa»</w:t>
-                            </w:r>
-                            <w:r>
-                              <w:rPr>
-                                <w:rFonts w:ascii="Arial" w:eastAsia="Arial Unicode MS" w:hAnsi="Arial"/>
-                                <w:sz w:val="18"/>
-                                <w:szCs w:val="18"/>
-                              </w:rPr>
-                              <w:fldChar w:fldCharType="end"/>
-                            </w:r>
-                          </w:p>
-                        </w:txbxContent>
-                      </v:textbox>
-                      <w10:wrap anchorx="margin"/>
-                    </v:roundrect>
-                  </w:pict>
-                </mc:Fallback>
-              </mc:AlternateContent>
-            </w:r>
-            <w:r>
-              <w:rPr>
                 <w:rFonts w:ascii="Aptos Black" w:hAnsi="Aptos Black"/>
                 <w:b/>
                 <w:bCs/>
@@ -259,6 +86,7 @@
               </w:rPr>
               <w:t>«</w:t>
             </w:r>
+            <w:proofErr w:type="spellStart"/>
             <w:r>
               <w:rPr>
                 <w:rFonts w:ascii="Aptos Black" w:hAnsi="Aptos Black"/>
@@ -267,6 +95,7 @@
               </w:rPr>
               <w:t>nro</w:t>
             </w:r>
+            <w:proofErr w:type="spellEnd"/>
             <w:r>
               <w:rPr>
                 <w:rFonts w:ascii="Aptos Black" w:hAnsi="Aptos Black"/>
@@ -494,7 +323,7 @@
           </w:tcPr>
           <w:p>
             <w:pPr>
-              <w:ind w:left="114" w:right="-29"/>
+              <w:ind w:left="114" w:right="513"/>
               <w:jc w:val="center"/>
               <w:rPr>
                 <w:sz w:val="144"/>
@@ -2929,23 +2758,6 @@
 </file>
 
 <file path=customXml/item1.xml><?xml version="1.0" encoding="utf-8"?>
-<?mso-contentType ?>
-<FormTemplates xmlns="http://schemas.microsoft.com/sharepoint/v3/contenttype/forms">
-  <Display>DocumentLibraryForm</Display>
-  <Edit>DocumentLibraryForm</Edit>
-  <New>DocumentLibraryForm</New>
-</FormTemplates>
-</file>
-
-<file path=customXml/item2.xml><?xml version="1.0" encoding="utf-8"?>
-<p:properties xmlns:p="http://schemas.microsoft.com/office/2006/metadata/properties" xmlns:xsi="http://www.w3.org/2001/XMLSchema-instance" xmlns:pc="http://schemas.microsoft.com/office/infopath/2007/PartnerControls">
-  <documentManagement>
-    <MediaServiceKeyPoints xmlns="71af3243-3dd4-4a8d-8c0d-dd76da1f02a5" xsi:nil="true"/>
-  </documentManagement>
-</p:properties>
-</file>
-
-<file path=customXml/item3.xml><?xml version="1.0" encoding="utf-8"?>
 <ct:contentTypeSchema xmlns:ct="http://schemas.microsoft.com/office/2006/metadata/contentType" xmlns:ma="http://schemas.microsoft.com/office/2006/metadata/properties/metaAttributes" ct:_="" ma:_="" ma:contentTypeName="Document" ma:contentTypeID="0x01010079F111ED35F8CC479449609E8A0923A6" ma:contentTypeVersion="11" ma:contentTypeDescription="Create a new document." ma:contentTypeScope="" ma:versionID="1c2eb7a32e66fb6e4260f3771546a5e2">
   <xsd:schema xmlns:xsd="http://www.w3.org/2001/XMLSchema" xmlns:xs="http://www.w3.org/2001/XMLSchema" xmlns:p="http://schemas.microsoft.com/office/2006/metadata/properties" xmlns:ns2="71af3243-3dd4-4a8d-8c0d-dd76da1f02a5" xmlns:ns3="16c05727-aa75-4e4a-9b5f-8a80a1165891" targetNamespace="http://schemas.microsoft.com/office/2006/metadata/properties" ma:root="true" ma:fieldsID="04e1f6479c48b08974ba73b5ca973489" ns2:_="" ns3:_="">
     <xsd:import namespace="71af3243-3dd4-4a8d-8c0d-dd76da1f02a5"/>
@@ -3156,25 +2968,24 @@
 </ct:contentTypeSchema>
 </file>
 
-<file path=customXml/itemProps1.xml><?xml version="1.0" encoding="utf-8"?>
-<ds:datastoreItem xmlns:ds="http://schemas.openxmlformats.org/officeDocument/2006/customXml" ds:itemID="{BEA6D05B-AD60-405F-B8DB-FC61ABCDF8E2}">
-  <ds:schemaRefs>
-    <ds:schemaRef ds:uri="http://schemas.microsoft.com/sharepoint/v3/contenttype/forms"/>
-  </ds:schemaRefs>
-</ds:datastoreItem>
+<file path=customXml/item2.xml><?xml version="1.0" encoding="utf-8"?>
+<p:properties xmlns:p="http://schemas.microsoft.com/office/2006/metadata/properties" xmlns:xsi="http://www.w3.org/2001/XMLSchema-instance" xmlns:pc="http://schemas.microsoft.com/office/infopath/2007/PartnerControls">
+  <documentManagement>
+    <MediaServiceKeyPoints xmlns="71af3243-3dd4-4a8d-8c0d-dd76da1f02a5" xsi:nil="true"/>
+  </documentManagement>
+</p:properties>
 </file>
 
-<file path=customXml/itemProps2.xml><?xml version="1.0" encoding="utf-8"?>
-<ds:datastoreItem xmlns:ds="http://schemas.openxmlformats.org/officeDocument/2006/customXml" ds:itemID="{B550BB7C-2FBC-4612-9ECE-2EA076035D14}">
-  <ds:schemaRefs>
-    <ds:schemaRef ds:uri="http://schemas.microsoft.com/office/2006/metadata/properties"/>
-    <ds:schemaRef ds:uri="http://schemas.microsoft.com/office/infopath/2007/PartnerControls"/>
-    <ds:schemaRef ds:uri="71af3243-3dd4-4a8d-8c0d-dd76da1f02a5"/>
-  </ds:schemaRefs>
-</ds:datastoreItem>
+<file path=customXml/item3.xml><?xml version="1.0" encoding="utf-8"?>
+<?mso-contentType ?>
+<FormTemplates xmlns="http://schemas.microsoft.com/sharepoint/v3/contenttype/forms">
+  <Display>DocumentLibraryForm</Display>
+  <Edit>DocumentLibraryForm</Edit>
+  <New>DocumentLibraryForm</New>
+</FormTemplates>
 </file>
 
-<file path=customXml/itemProps3.xml><?xml version="1.0" encoding="utf-8"?>
+<file path=customXml/itemProps1.xml><?xml version="1.0" encoding="utf-8"?>
 <ds:datastoreItem xmlns:ds="http://schemas.openxmlformats.org/officeDocument/2006/customXml" ds:itemID="{23573660-FE3A-4463-827C-CAE2430F8500}">
   <ds:schemaRefs>
     <ds:schemaRef ds:uri="http://schemas.microsoft.com/office/2006/metadata/contentType"/>
@@ -3191,4 +3002,22 @@
     <ds:schemaRef ds:uri="http://schemas.microsoft.com/internal/obd"/>
   </ds:schemaRefs>
 </ds:datastoreItem>
+</file>
+
+<file path=customXml/itemProps2.xml><?xml version="1.0" encoding="utf-8"?>
+<ds:datastoreItem xmlns:ds="http://schemas.openxmlformats.org/officeDocument/2006/customXml" ds:itemID="{B550BB7C-2FBC-4612-9ECE-2EA076035D14}">
+  <ds:schemaRefs>
+    <ds:schemaRef ds:uri="http://schemas.microsoft.com/office/2006/metadata/properties"/>
+    <ds:schemaRef ds:uri="http://schemas.microsoft.com/office/infopath/2007/PartnerControls"/>
+    <ds:schemaRef ds:uri="71af3243-3dd4-4a8d-8c0d-dd76da1f02a5"/>
+  </ds:schemaRefs>
+</ds:datastoreItem>
+</file>
+
+<file path=customXml/itemProps3.xml><?xml version="1.0" encoding="utf-8"?>
+<ds:datastoreItem xmlns:ds="http://schemas.openxmlformats.org/officeDocument/2006/customXml" ds:itemID="{BEA6D05B-AD60-405F-B8DB-FC61ABCDF8E2}">
+  <ds:schemaRefs>
+    <ds:schemaRef ds:uri="http://schemas.microsoft.com/sharepoint/v3/contenttype/forms"/>
+  </ds:schemaRefs>
+</ds:datastoreItem>
 </file>
</xml_diff>